<commit_message>
chore: clean up project files and add documentation
- Add README.md with installation and usage guide
- Add .env.example template
- Remove test scripts and temporary files
- Update .gitignore with new patterns
- Optimize faiss_search.py with lazy loading and error handling
- Optimize reranker.py with better exception handling
- Update progress report document
</commit_message>
<xml_diff>
--- a/鲁棒性Report_Formatted.docx
+++ b/鲁棒性Report_Formatted.docx
@@ -51,6 +51,33 @@
         <w:t>Implementation of the Reranker Module: To directly mitigate the semantic constraints of pure vector matching, a newly designed Reranker module was implemented from scratch. The backend retrieval architecture now establishes a complete closure consisting of "Vector + BM25 + Rerank," successfully achieving structural parity with the core RAGFlow retrieval layer.</w:t>
       </w:r>
     </w:p>
+    <w:p>
+      <w:pPr>
+        <w:rPr>
+          <w:rFonts w:hint="default" w:eastAsia="宋体"/>
+          <w:lang w:val="en-US" w:eastAsia="zh-CN"/>
+        </w:rPr>
+      </w:pPr>
+      <w:r>
+        <w:rPr>
+          <w:rFonts w:hint="eastAsia"/>
+          <w:b/>
+          <w:bCs/>
+          <w:lang w:val="en-US" w:eastAsia="zh-CN"/>
+        </w:rPr>
+        <w:t>3.</w:t>
+      </w:r>
+      <w:r>
+        <w:rPr>
+          <w:rFonts w:hint="eastAsia"/>
+          <w:lang w:val="en-US" w:eastAsia="zh-CN"/>
+        </w:rPr>
+        <w:t xml:space="preserve"> </w:t>
+      </w:r>
+      <w:r>
+        <w:t>Integrate LLM to enable intelligent QA. Route reranked retrieval results into Gemini 2.5 Flash context, transforming search-only into a full RAG pipeline.</w:t>
+      </w:r>
+    </w:p>
     <w:p/>
     <w:p>
       <w:pPr>
@@ -102,6 +129,12 @@
             <w:insideH w:val="single" w:color="auto" w:sz="4" w:space="0"/>
             <w:insideV w:val="single" w:color="auto" w:sz="4" w:space="0"/>
           </w:tblBorders>
+          <w:tblCellMar>
+            <w:top w:w="0" w:type="dxa"/>
+            <w:left w:w="108" w:type="dxa"/>
+            <w:bottom w:w="0" w:type="dxa"/>
+            <w:right w:w="108" w:type="dxa"/>
+          </w:tblCellMar>
         </w:tblPrEx>
         <w:trPr>
           <w:jc w:val="center"/>
@@ -168,6 +201,12 @@
             <w:insideH w:val="single" w:color="auto" w:sz="4" w:space="0"/>
             <w:insideV w:val="single" w:color="auto" w:sz="4" w:space="0"/>
           </w:tblBorders>
+          <w:tblCellMar>
+            <w:top w:w="0" w:type="dxa"/>
+            <w:left w:w="108" w:type="dxa"/>
+            <w:bottom w:w="0" w:type="dxa"/>
+            <w:right w:w="108" w:type="dxa"/>
+          </w:tblCellMar>
         </w:tblPrEx>
         <w:trPr>
           <w:jc w:val="center"/>
@@ -1131,12 +1170,7 @@
               <w:jc w:val="center"/>
             </w:pPr>
             <w:r>
-              <w:t xml:space="preserve"> De</w:t>
-            </w:r>
-            <w:bookmarkStart w:id="0" w:name="_GoBack"/>
-            <w:bookmarkEnd w:id="0"/>
-            <w:r>
-              <w:t>epDoc</w:t>
+              <w:t xml:space="preserve"> DeepDoc</w:t>
             </w:r>
           </w:p>
         </w:tc>
@@ -1212,8 +1246,10 @@
               <w:spacing w:after="0" w:line="240" w:lineRule="auto"/>
               <w:jc w:val="center"/>
             </w:pPr>
+            <w:bookmarkStart w:id="0" w:name="_GoBack"/>
+            <w:bookmarkEnd w:id="0"/>
             <w:r>
-              <w:t>✅Full Implementation</w:t>
+              <w:t>Full Implementation</w:t>
             </w:r>
           </w:p>
         </w:tc>
@@ -1272,11 +1308,20 @@
           </w:tcPr>
           <w:p>
             <w:pPr>
-              <w:spacing w:after="0" w:line="240" w:lineRule="auto"/>
-              <w:jc w:val="center"/>
+              <w:rPr>
+                <w:rFonts w:hint="default" w:eastAsia="宋体"/>
+                <w:lang w:val="en-US" w:eastAsia="zh-CN"/>
+              </w:rPr>
             </w:pPr>
             <w:r>
-              <w:t xml:space="preserve"> Partial</w:t>
+              <w:t xml:space="preserve"> Full</w:t>
+            </w:r>
+            <w:r>
+              <w:rPr>
+                <w:rFonts w:hint="eastAsia"/>
+                <w:lang w:val="en-US" w:eastAsia="zh-CN"/>
+              </w:rPr>
+              <w:t xml:space="preserve"> Implemented</w:t>
             </w:r>
           </w:p>
         </w:tc>
@@ -1299,12 +1344,8 @@
             <w:tcW w:w="2160" w:type="dxa"/>
           </w:tcPr>
           <w:p>
-            <w:pPr>
-              <w:spacing w:after="0" w:line="240" w:lineRule="auto"/>
-              <w:jc w:val="center"/>
-            </w:pPr>
             <w:r>
-              <w:t>Gemini 2.5 Flash successfully integrated as reranking and understanding foundation; rapid follow-up in progress.</w:t>
+              <w:t>Gemini 2.5 Flash successfully integrated as reranking and understanding foundation; LLM QA pipeline fully operational.</w:t>
             </w:r>
           </w:p>
         </w:tc>
@@ -1474,37 +1515,12 @@
         </w:tc>
       </w:tr>
     </w:tbl>
-    <w:p/>
-    <w:p>
-      <w:pPr>
-        <w:pStyle w:val="4"/>
-      </w:pPr>
-      <w:r>
-        <w:t>5. Upcoming Sprint Roadmap (LLM Integration Phase)</w:t>
-      </w:r>
-    </w:p>
     <w:p>
       <w:pPr>
         <w:rPr>
-          <w:rFonts w:hint="default" w:ascii="Times New Roman" w:hAnsi="Times New Roman" w:cs="Times New Roman"/>
-          <w:sz w:val="21"/>
-          <w:szCs w:val="21"/>
+          <w:rFonts w:hint="default"/>
         </w:rPr>
       </w:pPr>
-      <w:r>
-        <w:rPr>
-          <w:b/>
-        </w:rPr>
-        <w:t>•</w:t>
-      </w:r>
-      <w:r>
-        <w:rPr>
-          <w:rFonts w:hint="default" w:ascii="Times New Roman" w:hAnsi="Times New Roman" w:eastAsia="宋体" w:cs="Times New Roman"/>
-          <w:sz w:val="21"/>
-          <w:szCs w:val="21"/>
-        </w:rPr>
-        <w:t>Integrate LLM to enable intelligent QA. Route reranked retrieval results into Gemini 2.5 Flash context, transforming search-only into a full RAG pipeline.</w:t>
-      </w:r>
     </w:p>
     <w:sectPr>
       <w:footerReference r:id="rId5" w:type="default"/>
@@ -1763,8 +1779,8 @@
     <w:lsdException w:uiPriority="99" w:name="Normal Indent"/>
     <w:lsdException w:uiPriority="99" w:name="footnote text"/>
     <w:lsdException w:uiPriority="99" w:name="annotation text"/>
-    <w:lsdException w:uiPriority="99" w:semiHidden="0" w:name="header"/>
-    <w:lsdException w:uiPriority="99" w:semiHidden="0" w:name="footer"/>
+    <w:lsdException w:qFormat="1" w:uiPriority="99" w:semiHidden="0" w:name="header"/>
+    <w:lsdException w:qFormat="1" w:uiPriority="99" w:semiHidden="0" w:name="footer"/>
     <w:lsdException w:uiPriority="99" w:name="index heading"/>
     <w:lsdException w:qFormat="1" w:uiPriority="35" w:name="caption"/>
     <w:lsdException w:uiPriority="99" w:name="table of figures"/>
@@ -1779,7 +1795,7 @@
     <w:lsdException w:uiPriority="99" w:name="table of authorities"/>
     <w:lsdException w:uiPriority="99" w:semiHidden="0" w:name="macro"/>
     <w:lsdException w:uiPriority="99" w:name="toa heading"/>
-    <w:lsdException w:uiPriority="99" w:semiHidden="0" w:name="List"/>
+    <w:lsdException w:qFormat="1" w:uiPriority="99" w:semiHidden="0" w:name="List"/>
     <w:lsdException w:uiPriority="99" w:semiHidden="0" w:name="List Bullet"/>
     <w:lsdException w:qFormat="1" w:uiPriority="99" w:semiHidden="0" w:name="List Number"/>
     <w:lsdException w:uiPriority="99" w:semiHidden="0" w:name="List 2"/>
@@ -1787,21 +1803,21 @@
     <w:lsdException w:uiPriority="99" w:name="List 4"/>
     <w:lsdException w:uiPriority="99" w:name="List 5"/>
     <w:lsdException w:uiPriority="99" w:semiHidden="0" w:name="List Bullet 2"/>
-    <w:lsdException w:uiPriority="99" w:semiHidden="0" w:name="List Bullet 3"/>
+    <w:lsdException w:qFormat="1" w:uiPriority="99" w:semiHidden="0" w:name="List Bullet 3"/>
     <w:lsdException w:uiPriority="99" w:name="List Bullet 4"/>
     <w:lsdException w:uiPriority="99" w:name="List Bullet 5"/>
     <w:lsdException w:uiPriority="99" w:semiHidden="0" w:name="List Number 2"/>
-    <w:lsdException w:uiPriority="99" w:semiHidden="0" w:name="List Number 3"/>
+    <w:lsdException w:qFormat="1" w:uiPriority="99" w:semiHidden="0" w:name="List Number 3"/>
     <w:lsdException w:uiPriority="99" w:name="List Number 4"/>
     <w:lsdException w:uiPriority="99" w:name="List Number 5"/>
     <w:lsdException w:qFormat="1" w:unhideWhenUsed="0" w:uiPriority="10" w:semiHidden="0" w:name="Title"/>
     <w:lsdException w:uiPriority="99" w:name="Closing"/>
     <w:lsdException w:uiPriority="99" w:name="Signature"/>
     <w:lsdException w:uiPriority="1" w:name="Default Paragraph Font"/>
-    <w:lsdException w:uiPriority="99" w:semiHidden="0" w:name="Body Text"/>
+    <w:lsdException w:qFormat="1" w:uiPriority="99" w:semiHidden="0" w:name="Body Text"/>
     <w:lsdException w:uiPriority="99" w:name="Body Text Indent"/>
-    <w:lsdException w:uiPriority="99" w:semiHidden="0" w:name="List Continue"/>
-    <w:lsdException w:uiPriority="99" w:semiHidden="0" w:name="List Continue 2"/>
+    <w:lsdException w:qFormat="1" w:uiPriority="99" w:semiHidden="0" w:name="List Continue"/>
+    <w:lsdException w:qFormat="1" w:uiPriority="99" w:semiHidden="0" w:name="List Continue 2"/>
     <w:lsdException w:uiPriority="99" w:semiHidden="0" w:name="List Continue 3"/>
     <w:lsdException w:uiPriority="99" w:name="List Continue 4"/>
     <w:lsdException w:uiPriority="99" w:name="List Continue 5"/>
@@ -1880,12 +1896,12 @@
     <w:lsdException w:uiPriority="99" w:name="Table Web 2"/>
     <w:lsdException w:uiPriority="99" w:name="Table Web 3"/>
     <w:lsdException w:uiPriority="99" w:name="Balloon Text"/>
-    <w:lsdException w:unhideWhenUsed="0" w:uiPriority="59" w:semiHidden="0" w:name="Table Grid"/>
+    <w:lsdException w:qFormat="1" w:unhideWhenUsed="0" w:uiPriority="59" w:semiHidden="0" w:name="Table Grid"/>
     <w:lsdException w:uiPriority="99" w:name="Table Theme"/>
     <w:lsdException w:qFormat="1" w:unhideWhenUsed="0" w:uiPriority="1" w:semiHidden="0" w:name="No Spacing"/>
     <w:lsdException w:unhideWhenUsed="0" w:uiPriority="60" w:semiHidden="0" w:name="Light Shading"/>
-    <w:lsdException w:unhideWhenUsed="0" w:uiPriority="61" w:semiHidden="0" w:name="Light List"/>
-    <w:lsdException w:unhideWhenUsed="0" w:uiPriority="62" w:semiHidden="0" w:name="Light Grid"/>
+    <w:lsdException w:qFormat="1" w:unhideWhenUsed="0" w:uiPriority="61" w:semiHidden="0" w:name="Light List"/>
+    <w:lsdException w:qFormat="1" w:unhideWhenUsed="0" w:uiPriority="62" w:semiHidden="0" w:name="Light Grid"/>
     <w:lsdException w:qFormat="1" w:unhideWhenUsed="0" w:uiPriority="63" w:semiHidden="0" w:name="Medium Shading 1"/>
     <w:lsdException w:qFormat="1" w:unhideWhenUsed="0" w:uiPriority="64" w:semiHidden="0" w:name="Medium Shading 2"/>
     <w:lsdException w:qFormat="1" w:unhideWhenUsed="0" w:uiPriority="65" w:semiHidden="0" w:name="Medium List 1"/>
@@ -1897,9 +1913,9 @@
     <w:lsdException w:qFormat="1" w:unhideWhenUsed="0" w:uiPriority="71" w:semiHidden="0" w:name="Colorful Shading"/>
     <w:lsdException w:qFormat="1" w:unhideWhenUsed="0" w:uiPriority="72" w:semiHidden="0" w:name="Colorful List"/>
     <w:lsdException w:qFormat="1" w:unhideWhenUsed="0" w:uiPriority="73" w:semiHidden="0" w:name="Colorful Grid"/>
-    <w:lsdException w:unhideWhenUsed="0" w:uiPriority="60" w:semiHidden="0" w:name="Light Shading Accent 1"/>
+    <w:lsdException w:qFormat="1" w:unhideWhenUsed="0" w:uiPriority="60" w:semiHidden="0" w:name="Light Shading Accent 1"/>
     <w:lsdException w:unhideWhenUsed="0" w:uiPriority="61" w:semiHidden="0" w:name="Light List Accent 1"/>
-    <w:lsdException w:unhideWhenUsed="0" w:uiPriority="62" w:semiHidden="0" w:name="Light Grid Accent 1"/>
+    <w:lsdException w:qFormat="1" w:unhideWhenUsed="0" w:uiPriority="62" w:semiHidden="0" w:name="Light Grid Accent 1"/>
     <w:lsdException w:qFormat="1" w:unhideWhenUsed="0" w:uiPriority="63" w:semiHidden="0" w:name="Medium Shading 1 Accent 1"/>
     <w:lsdException w:qFormat="1" w:unhideWhenUsed="0" w:uiPriority="64" w:semiHidden="0" w:name="Medium Shading 2 Accent 1"/>
     <w:lsdException w:qFormat="1" w:unhideWhenUsed="0" w:uiPriority="65" w:semiHidden="0" w:name="Medium List 1 Accent 1"/>
@@ -1914,9 +1930,9 @@
     <w:lsdException w:qFormat="1" w:unhideWhenUsed="0" w:uiPriority="71" w:semiHidden="0" w:name="Colorful Shading Accent 1"/>
     <w:lsdException w:qFormat="1" w:unhideWhenUsed="0" w:uiPriority="72" w:semiHidden="0" w:name="Colorful List Accent 1"/>
     <w:lsdException w:qFormat="1" w:unhideWhenUsed="0" w:uiPriority="73" w:semiHidden="0" w:name="Colorful Grid Accent 1"/>
-    <w:lsdException w:unhideWhenUsed="0" w:uiPriority="60" w:semiHidden="0" w:name="Light Shading Accent 2"/>
-    <w:lsdException w:unhideWhenUsed="0" w:uiPriority="61" w:semiHidden="0" w:name="Light List Accent 2"/>
-    <w:lsdException w:unhideWhenUsed="0" w:uiPriority="62" w:semiHidden="0" w:name="Light Grid Accent 2"/>
+    <w:lsdException w:qFormat="1" w:unhideWhenUsed="0" w:uiPriority="60" w:semiHidden="0" w:name="Light Shading Accent 2"/>
+    <w:lsdException w:qFormat="1" w:unhideWhenUsed="0" w:uiPriority="61" w:semiHidden="0" w:name="Light List Accent 2"/>
+    <w:lsdException w:qFormat="1" w:unhideWhenUsed="0" w:uiPriority="62" w:semiHidden="0" w:name="Light Grid Accent 2"/>
     <w:lsdException w:qFormat="1" w:unhideWhenUsed="0" w:uiPriority="63" w:semiHidden="0" w:name="Medium Shading 1 Accent 2"/>
     <w:lsdException w:qFormat="1" w:unhideWhenUsed="0" w:uiPriority="64" w:semiHidden="0" w:name="Medium Shading 2 Accent 2"/>
     <w:lsdException w:qFormat="1" w:unhideWhenUsed="0" w:uiPriority="65" w:semiHidden="0" w:name="Medium List 1 Accent 2"/>
@@ -1928,8 +1944,8 @@
     <w:lsdException w:qFormat="1" w:unhideWhenUsed="0" w:uiPriority="71" w:semiHidden="0" w:name="Colorful Shading Accent 2"/>
     <w:lsdException w:qFormat="1" w:unhideWhenUsed="0" w:uiPriority="72" w:semiHidden="0" w:name="Colorful List Accent 2"/>
     <w:lsdException w:qFormat="1" w:unhideWhenUsed="0" w:uiPriority="73" w:semiHidden="0" w:name="Colorful Grid Accent 2"/>
-    <w:lsdException w:unhideWhenUsed="0" w:uiPriority="60" w:semiHidden="0" w:name="Light Shading Accent 3"/>
-    <w:lsdException w:unhideWhenUsed="0" w:uiPriority="61" w:semiHidden="0" w:name="Light List Accent 3"/>
+    <w:lsdException w:qFormat="1" w:unhideWhenUsed="0" w:uiPriority="60" w:semiHidden="0" w:name="Light Shading Accent 3"/>
+    <w:lsdException w:qFormat="1" w:unhideWhenUsed="0" w:uiPriority="61" w:semiHidden="0" w:name="Light List Accent 3"/>
     <w:lsdException w:qFormat="1" w:unhideWhenUsed="0" w:uiPriority="62" w:semiHidden="0" w:name="Light Grid Accent 3"/>
     <w:lsdException w:qFormat="1" w:unhideWhenUsed="0" w:uiPriority="63" w:semiHidden="0" w:name="Medium Shading 1 Accent 3"/>
     <w:lsdException w:qFormat="1" w:unhideWhenUsed="0" w:uiPriority="64" w:semiHidden="0" w:name="Medium Shading 2 Accent 3"/>
@@ -1942,8 +1958,8 @@
     <w:lsdException w:qFormat="1" w:unhideWhenUsed="0" w:uiPriority="71" w:semiHidden="0" w:name="Colorful Shading Accent 3"/>
     <w:lsdException w:qFormat="1" w:unhideWhenUsed="0" w:uiPriority="72" w:semiHidden="0" w:name="Colorful List Accent 3"/>
     <w:lsdException w:qFormat="1" w:unhideWhenUsed="0" w:uiPriority="73" w:semiHidden="0" w:name="Colorful Grid Accent 3"/>
-    <w:lsdException w:unhideWhenUsed="0" w:uiPriority="60" w:semiHidden="0" w:name="Light Shading Accent 4"/>
-    <w:lsdException w:unhideWhenUsed="0" w:uiPriority="61" w:semiHidden="0" w:name="Light List Accent 4"/>
+    <w:lsdException w:qFormat="1" w:unhideWhenUsed="0" w:uiPriority="60" w:semiHidden="0" w:name="Light Shading Accent 4"/>
+    <w:lsdException w:qFormat="1" w:unhideWhenUsed="0" w:uiPriority="61" w:semiHidden="0" w:name="Light List Accent 4"/>
     <w:lsdException w:qFormat="1" w:unhideWhenUsed="0" w:uiPriority="62" w:semiHidden="0" w:name="Light Grid Accent 4"/>
     <w:lsdException w:qFormat="1" w:unhideWhenUsed="0" w:uiPriority="63" w:semiHidden="0" w:name="Medium Shading 1 Accent 4"/>
     <w:lsdException w:qFormat="1" w:unhideWhenUsed="0" w:uiPriority="64" w:semiHidden="0" w:name="Medium Shading 2 Accent 4"/>
@@ -1957,7 +1973,7 @@
     <w:lsdException w:qFormat="1" w:unhideWhenUsed="0" w:uiPriority="72" w:semiHidden="0" w:name="Colorful List Accent 4"/>
     <w:lsdException w:qFormat="1" w:unhideWhenUsed="0" w:uiPriority="73" w:semiHidden="0" w:name="Colorful Grid Accent 4"/>
     <w:lsdException w:unhideWhenUsed="0" w:uiPriority="60" w:semiHidden="0" w:name="Light Shading Accent 5"/>
-    <w:lsdException w:unhideWhenUsed="0" w:uiPriority="61" w:semiHidden="0" w:name="Light List Accent 5"/>
+    <w:lsdException w:qFormat="1" w:unhideWhenUsed="0" w:uiPriority="61" w:semiHidden="0" w:name="Light List Accent 5"/>
     <w:lsdException w:qFormat="1" w:unhideWhenUsed="0" w:uiPriority="62" w:semiHidden="0" w:name="Light Grid Accent 5"/>
     <w:lsdException w:qFormat="1" w:unhideWhenUsed="0" w:uiPriority="63" w:semiHidden="0" w:name="Medium Shading 1 Accent 5"/>
     <w:lsdException w:qFormat="1" w:unhideWhenUsed="0" w:uiPriority="64" w:semiHidden="0" w:name="Medium Shading 2 Accent 5"/>
@@ -1970,8 +1986,8 @@
     <w:lsdException w:qFormat="1" w:unhideWhenUsed="0" w:uiPriority="71" w:semiHidden="0" w:name="Colorful Shading Accent 5"/>
     <w:lsdException w:qFormat="1" w:unhideWhenUsed="0" w:uiPriority="72" w:semiHidden="0" w:name="Colorful List Accent 5"/>
     <w:lsdException w:qFormat="1" w:unhideWhenUsed="0" w:uiPriority="73" w:semiHidden="0" w:name="Colorful Grid Accent 5"/>
-    <w:lsdException w:unhideWhenUsed="0" w:uiPriority="60" w:semiHidden="0" w:name="Light Shading Accent 6"/>
-    <w:lsdException w:unhideWhenUsed="0" w:uiPriority="61" w:semiHidden="0" w:name="Light List Accent 6"/>
+    <w:lsdException w:qFormat="1" w:unhideWhenUsed="0" w:uiPriority="60" w:semiHidden="0" w:name="Light Shading Accent 6"/>
+    <w:lsdException w:qFormat="1" w:unhideWhenUsed="0" w:uiPriority="61" w:semiHidden="0" w:name="Light List Accent 6"/>
     <w:lsdException w:qFormat="1" w:unhideWhenUsed="0" w:uiPriority="62" w:semiHidden="0" w:name="Light Grid Accent 6"/>
     <w:lsdException w:qFormat="1" w:unhideWhenUsed="0" w:uiPriority="63" w:semiHidden="0" w:name="Medium Shading 1 Accent 6"/>
     <w:lsdException w:qFormat="1" w:unhideWhenUsed="0" w:uiPriority="64" w:semiHidden="0" w:name="Medium Shading 2 Accent 6"/>
@@ -2373,6 +2389,7 @@
     <w:name w:val="List Bullet 3"/>
     <w:basedOn w:val="1"/>
     <w:unhideWhenUsed/>
+    <w:qFormat/>
     <w:uiPriority w:val="99"/>
     <w:pPr>
       <w:numPr>
@@ -2387,6 +2404,7 @@
     <w:basedOn w:val="1"/>
     <w:link w:val="144"/>
     <w:unhideWhenUsed/>
+    <w:qFormat/>
     <w:uiPriority w:val="99"/>
     <w:pPr>
       <w:spacing w:after="120"/>
@@ -2396,6 +2414,7 @@
     <w:name w:val="List Number 3"/>
     <w:basedOn w:val="1"/>
     <w:unhideWhenUsed/>
+    <w:qFormat/>
     <w:uiPriority w:val="99"/>
     <w:pPr>
       <w:numPr>
@@ -2419,6 +2438,7 @@
     <w:name w:val="List Continue"/>
     <w:basedOn w:val="1"/>
     <w:unhideWhenUsed/>
+    <w:qFormat/>
     <w:uiPriority w:val="99"/>
     <w:pPr>
       <w:spacing w:after="120"/>
@@ -2444,6 +2464,7 @@
     <w:basedOn w:val="1"/>
     <w:link w:val="136"/>
     <w:unhideWhenUsed/>
+    <w:qFormat/>
     <w:uiPriority w:val="99"/>
     <w:pPr>
       <w:tabs>
@@ -2458,6 +2479,7 @@
     <w:basedOn w:val="1"/>
     <w:link w:val="135"/>
     <w:unhideWhenUsed/>
+    <w:qFormat/>
     <w:uiPriority w:val="99"/>
     <w:pPr>
       <w:tabs>
@@ -2493,6 +2515,7 @@
     <w:name w:val="List"/>
     <w:basedOn w:val="1"/>
     <w:unhideWhenUsed/>
+    <w:qFormat/>
     <w:uiPriority w:val="99"/>
     <w:pPr>
       <w:ind w:left="360" w:hanging="360"/>
@@ -2513,6 +2536,7 @@
     <w:name w:val="List Continue 2"/>
     <w:basedOn w:val="1"/>
     <w:unhideWhenUsed/>
+    <w:qFormat/>
     <w:uiPriority w:val="99"/>
     <w:pPr>
       <w:spacing w:after="120"/>
@@ -2557,6 +2581,7 @@
   <w:style w:type="table" w:styleId="33">
     <w:name w:val="Table Grid"/>
     <w:basedOn w:val="32"/>
+    <w:qFormat/>
     <w:uiPriority w:val="59"/>
     <w:pPr>
       <w:spacing w:after="0" w:line="240" w:lineRule="auto"/>
@@ -2680,6 +2705,7 @@
   <w:style w:type="table" w:styleId="35">
     <w:name w:val="Light Shading Accent 1"/>
     <w:basedOn w:val="32"/>
+    <w:qFormat/>
     <w:uiPriority w:val="60"/>
     <w:pPr>
       <w:spacing w:after="0" w:line="240" w:lineRule="auto"/>
@@ -2779,6 +2805,7 @@
   <w:style w:type="table" w:styleId="36">
     <w:name w:val="Light Shading Accent 2"/>
     <w:basedOn w:val="32"/>
+    <w:qFormat/>
     <w:uiPriority w:val="60"/>
     <w:pPr>
       <w:spacing w:after="0" w:line="240" w:lineRule="auto"/>
@@ -2878,6 +2905,7 @@
   <w:style w:type="table" w:styleId="37">
     <w:name w:val="Light Shading Accent 3"/>
     <w:basedOn w:val="32"/>
+    <w:qFormat/>
     <w:uiPriority w:val="60"/>
     <w:pPr>
       <w:spacing w:after="0" w:line="240" w:lineRule="auto"/>
@@ -2977,6 +3005,7 @@
   <w:style w:type="table" w:styleId="38">
     <w:name w:val="Light Shading Accent 4"/>
     <w:basedOn w:val="32"/>
+    <w:qFormat/>
     <w:uiPriority w:val="60"/>
     <w:pPr>
       <w:spacing w:after="0" w:line="240" w:lineRule="auto"/>
@@ -3175,6 +3204,7 @@
   <w:style w:type="table" w:styleId="40">
     <w:name w:val="Light Shading Accent 6"/>
     <w:basedOn w:val="32"/>
+    <w:qFormat/>
     <w:uiPriority w:val="60"/>
     <w:pPr>
       <w:spacing w:after="0" w:line="240" w:lineRule="auto"/>
@@ -3274,6 +3304,7 @@
   <w:style w:type="table" w:styleId="41">
     <w:name w:val="Light List"/>
     <w:basedOn w:val="32"/>
+    <w:qFormat/>
     <w:uiPriority w:val="61"/>
     <w:pPr>
       <w:spacing w:after="0" w:line="240" w:lineRule="auto"/>
@@ -3460,6 +3491,7 @@
   <w:style w:type="table" w:styleId="43">
     <w:name w:val="Light List Accent 2"/>
     <w:basedOn w:val="32"/>
+    <w:qFormat/>
     <w:uiPriority w:val="61"/>
     <w:pPr>
       <w:spacing w:after="0" w:line="240" w:lineRule="auto"/>
@@ -3553,6 +3585,7 @@
   <w:style w:type="table" w:styleId="44">
     <w:name w:val="Light List Accent 3"/>
     <w:basedOn w:val="32"/>
+    <w:qFormat/>
     <w:uiPriority w:val="61"/>
     <w:pPr>
       <w:spacing w:after="0" w:line="240" w:lineRule="auto"/>
@@ -3646,6 +3679,7 @@
   <w:style w:type="table" w:styleId="45">
     <w:name w:val="Light List Accent 4"/>
     <w:basedOn w:val="32"/>
+    <w:qFormat/>
     <w:uiPriority w:val="61"/>
     <w:pPr>
       <w:spacing w:after="0" w:line="240" w:lineRule="auto"/>
@@ -3739,6 +3773,7 @@
   <w:style w:type="table" w:styleId="46">
     <w:name w:val="Light List Accent 5"/>
     <w:basedOn w:val="32"/>
+    <w:qFormat/>
     <w:uiPriority w:val="61"/>
     <w:pPr>
       <w:spacing w:after="0" w:line="240" w:lineRule="auto"/>
@@ -3832,6 +3867,7 @@
   <w:style w:type="table" w:styleId="47">
     <w:name w:val="Light List Accent 6"/>
     <w:basedOn w:val="32"/>
+    <w:qFormat/>
     <w:uiPriority w:val="61"/>
     <w:pPr>
       <w:spacing w:after="0" w:line="240" w:lineRule="auto"/>
@@ -3925,6 +3961,7 @@
   <w:style w:type="table" w:styleId="48">
     <w:name w:val="Light Grid"/>
     <w:basedOn w:val="32"/>
+    <w:qFormat/>
     <w:uiPriority w:val="62"/>
     <w:pPr>
       <w:spacing w:after="0" w:line="240" w:lineRule="auto"/>
@@ -4051,6 +4088,7 @@
   <w:style w:type="table" w:styleId="49">
     <w:name w:val="Light Grid Accent 1"/>
     <w:basedOn w:val="32"/>
+    <w:qFormat/>
     <w:uiPriority w:val="62"/>
     <w:pPr>
       <w:spacing w:after="0" w:line="240" w:lineRule="auto"/>
@@ -4177,6 +4215,7 @@
   <w:style w:type="table" w:styleId="50">
     <w:name w:val="Light Grid Accent 2"/>
     <w:basedOn w:val="32"/>
+    <w:qFormat/>
     <w:uiPriority w:val="62"/>
     <w:pPr>
       <w:spacing w:after="0" w:line="240" w:lineRule="auto"/>

</xml_diff>

<commit_message>
chore: remove organized_documents test data directory
</commit_message>
<xml_diff>
--- a/鲁棒性Report_Formatted.docx
+++ b/鲁棒性Report_Formatted.docx
@@ -25,7 +25,21 @@
         <w:rPr>
           <w:b/>
         </w:rPr>
-        <w:t>This week's engineering objectives focused on two primary tasks:</w:t>
+        <w:t>This week's engineering objectives focused on t</w:t>
+      </w:r>
+      <w:r>
+        <w:rPr>
+          <w:rFonts w:hint="eastAsia"/>
+          <w:b/>
+          <w:lang w:val="en-US" w:eastAsia="zh-CN"/>
+        </w:rPr>
+        <w:t>hree</w:t>
+      </w:r>
+      <w:r>
+        <w:rPr>
+          <w:b/>
+        </w:rPr>
+        <w:t xml:space="preserve"> primary tasks:</w:t>
       </w:r>
     </w:p>
     <w:p/>
@@ -37,7 +51,7 @@
         <w:t xml:space="preserve">1. </w:t>
       </w:r>
       <w:r>
-        <w:t>Robustness Testing Following Prior Guidance: Conducted comprehensive stress and robustness testing on our custom ingestion pipeline (In-house Pipeline). The verification matrix was refined into 11 distinct dimensions, thoroughly capturing your highlighted criteria—Content (Table Extraction), File Size, Performance Time, and File Type—while expanding coverage to include concurrency, malformed inputs, and log observability.</w:t>
+        <w:t>Robustness Testing Following Prior Guidance: Conducted comprehensive stress and robustness testing on our custom ingestion pipeline. The verification matrix was refined into 11 distinct dimensions, thoroughly capturing your highlighted criteria—Content (Table Extraction), File Size, Performance Time, and File Type—while expanding coverage to include concurrency, malformed inputs, and log observability.</w:t>
       </w:r>
     </w:p>
     <w:p>
@@ -48,7 +62,17 @@
         <w:t xml:space="preserve">2. </w:t>
       </w:r>
       <w:r>
-        <w:t>Implementation of the Reranker Module: To directly mitigate the semantic constraints of pure vector matching, a newly designed Reranker module was implemented from scratch. The backend retrieval architecture now establishes a complete closure consisting of "Vector + BM25 + Rerank," successfully achieving structural parity with the core RAGFlow retrieval layer.</w:t>
+        <w:t xml:space="preserve">Implementation of the Reranker Module: To directly mitigate the semantic constraints of pure vector matching, a </w:t>
+      </w:r>
+      <w:r>
+        <w:rPr>
+          <w:b/>
+          <w:bCs/>
+        </w:rPr>
+        <w:t>newly designed Reranker module</w:t>
+      </w:r>
+      <w:r>
+        <w:t xml:space="preserve"> was implemented from scratch. The backend retrieval architecture now establishes a complete closure consisting of "Vector + BM25 + Rerank," successfully achieving structural parity with the core RAGFlow retrieval layer.</w:t>
       </w:r>
     </w:p>
     <w:p>
@@ -885,38 +909,10 @@
         </w:tc>
       </w:tr>
     </w:tbl>
-    <w:p/>
     <w:p>
-      <w:pPr>
-        <w:pStyle w:val="5"/>
-      </w:pPr>
-      <w:r>
-        <w:t>2.1 Accompanying Code Fixes</w:t>
-      </w:r>
+      <w:bookmarkStart w:id="0" w:name="_GoBack"/>
+      <w:bookmarkEnd w:id="0"/>
     </w:p>
-    <w:p>
-      <w:r>
-        <w:rPr>
-          <w:b/>
-        </w:rPr>
-        <w:t xml:space="preserve">• Input Defense: </w:t>
-      </w:r>
-      <w:r>
-        <w:t>Added zero-size detection in validate_file() and limited filenames to ≤ 200 characters to prevent file path overflow.</w:t>
-      </w:r>
-    </w:p>
-    <w:p>
-      <w:r>
-        <w:rPr>
-          <w:b/>
-        </w:rPr>
-        <w:t xml:space="preserve">• Duplicate Removal: </w:t>
-      </w:r>
-      <w:r>
-        <w:t>Fixed search result deduplication logic, using content-based MD5 hashing for deduplication.</w:t>
-      </w:r>
-    </w:p>
-    <w:p/>
     <w:p>
       <w:pPr>
         <w:pStyle w:val="4"/>
@@ -1246,8 +1242,6 @@
               <w:spacing w:after="0" w:line="240" w:lineRule="auto"/>
               <w:jc w:val="center"/>
             </w:pPr>
-            <w:bookmarkStart w:id="0" w:name="_GoBack"/>
-            <w:bookmarkEnd w:id="0"/>
             <w:r>
               <w:t>Full Implementation</w:t>
             </w:r>

</xml_diff>